<commit_message>
merge: fixes from advisors and data room improvments
</commit_message>
<xml_diff>
--- a/dataroom/1_company_fundamentals/1.3_company_docs/ecentic-shareholders-agreement.docx
+++ b/dataroom/1_company_fundamentals/1.3_company_docs/ecentic-shareholders-agreement.docx
@@ -9118,6 +9118,8 @@
           <w:rFonts w:ascii="Times New Roman" w:hAnsi="Times New Roman" w:cs="Times New Roman"/>
         </w:rPr>
         <w:sectPr>
+          <w:headerReference xmlns:r="http://schemas.openxmlformats.org/officeDocument/2006/relationships" w:type="default" r:id="rId12"/>
+          <w:footerReference xmlns:r="http://schemas.openxmlformats.org/officeDocument/2006/relationships" w:type="default" r:id="rId13"/>
           <w:footerReference w:type="even" r:id="rId7"/>
           <w:footerReference w:type="default" r:id="rId8"/>
           <w:pgSz w:w="12240" w:h="15840"/>
@@ -21975,6 +21977,92 @@
     </w:p>
   </w:endnote>
 </w:endnotes>
+</file>
+
+<file path=word/footer.xml><?xml version="1.0" encoding="utf-8"?>
+<w:ftr xmlns:w14="http://schemas.microsoft.com/office/word/2010/wordml" xmlns:w="http://schemas.openxmlformats.org/wordprocessingml/2006/main">
+  <w:tbl>
+    <w:tblPr>
+      <w:tblStyle w:val="TableNormal"/>
+      <w:bidiVisual w:val="0"/>
+      <w:tblW w:w="0" w:type="auto"/>
+      <w:tblLook w:val="06A0" w:firstRow="1" w:lastRow="0" w:firstColumn="1" w:lastColumn="0" w:noHBand="1" w:noVBand="1"/>
+    </w:tblPr>
+    <w:tblGrid>
+      <w:gridCol w:w="3005"/>
+      <w:gridCol w:w="3005"/>
+      <w:gridCol w:w="3005"/>
+    </w:tblGrid>
+    <w:tr>
+      <w:trPr>
+        <w:trHeight w:val="300"/>
+      </w:trPr>
+      <w:tc>
+        <w:tcPr>
+          <w:tcW w:w="3005" w:type="dxa"/>
+          <w:tcMar/>
+        </w:tcPr>
+        <w:p>
+          <w:pPr>
+            <w:pStyle w:val="Header"/>
+            <w:bidi w:val="0"/>
+            <w:ind w:left="-115"/>
+            <w:jc w:val="left"/>
+          </w:pPr>
+          <w:r>
+            <w:rPr/>
+            <w:t>Confidential</w:t>
+          </w:r>
+        </w:p>
+      </w:tc>
+      <w:tc>
+        <w:tcPr>
+          <w:tcW w:w="3005" w:type="dxa"/>
+          <w:tcMar/>
+        </w:tcPr>
+        <w:p>
+          <w:pPr>
+            <w:pStyle w:val="Header"/>
+            <w:bidi w:val="0"/>
+            <w:jc w:val="center"/>
+          </w:pPr>
+        </w:p>
+      </w:tc>
+      <w:tc>
+        <w:tcPr>
+          <w:tcW w:w="3005" w:type="dxa"/>
+          <w:tcMar/>
+        </w:tcPr>
+        <w:p>
+          <w:pPr>
+            <w:pStyle w:val="Header"/>
+            <w:bidi w:val="0"/>
+            <w:ind w:right="-115"/>
+            <w:jc w:val="right"/>
+          </w:pPr>
+          <w:r>
+            <w:fldChar w:fldCharType="begin"/>
+          </w:r>
+          <w:r>
+            <w:instrText xml:space="preserve">PAGE</w:instrText>
+          </w:r>
+          <w:r>
+            <w:fldChar w:fldCharType="separate"/>
+          </w:r>
+          <w:r>
+            <w:fldChar w:fldCharType="end"/>
+          </w:r>
+        </w:p>
+      </w:tc>
+    </w:tr>
+  </w:tbl>
+  <w:p>
+    <w:pPr>
+      <w:pStyle w:val="Footer"/>
+      <w:bidi w:val="0"/>
+    </w:pPr>
+  </w:p>
+</w:ftr>
 </file>
 
 <file path=word/footer1.xml><?xml version="1.0" encoding="utf-8"?>
@@ -22134,6 +22222,147 @@
     </w:p>
   </w:footnote>
 </w:footnotes>
+</file>
+
+<file path=word/header.xml><?xml version="1.0" encoding="utf-8"?>
+<w:hdr xmlns:w14="http://schemas.microsoft.com/office/word/2010/wordml" xmlns:wp="http://schemas.openxmlformats.org/drawingml/2006/wordprocessingDrawing" xmlns:wp14="http://schemas.microsoft.com/office/word/2010/wordprocessingDrawing" xmlns:a="http://schemas.openxmlformats.org/drawingml/2006/main" xmlns:pic="http://schemas.openxmlformats.org/drawingml/2006/picture" xmlns:r="http://schemas.openxmlformats.org/officeDocument/2006/relationships" xmlns:a14="http://schemas.microsoft.com/office/drawing/2010/main" xmlns:w="http://schemas.openxmlformats.org/wordprocessingml/2006/main">
+  <w:tbl>
+    <w:tblPr>
+      <w:tblStyle w:val="TableNormal"/>
+      <w:bidiVisual w:val="0"/>
+      <w:tblW w:w="0" w:type="auto"/>
+      <w:tblLook w:val="06A0" w:firstRow="1" w:lastRow="0" w:firstColumn="1" w:lastColumn="0" w:noHBand="1" w:noVBand="1"/>
+    </w:tblPr>
+    <w:tblGrid>
+      <w:gridCol w:w="3005"/>
+      <w:gridCol w:w="3005"/>
+      <w:gridCol w:w="3135"/>
+    </w:tblGrid>
+    <w:tr>
+      <w:trPr>
+        <w:trHeight w:val="300"/>
+      </w:trPr>
+      <w:tc>
+        <w:tcPr>
+          <w:tcW w:w="3005" w:type="dxa"/>
+          <w:tcMar/>
+        </w:tcPr>
+        <w:p>
+          <w:pPr>
+            <w:pStyle w:val="Header"/>
+            <w:bidi w:val="0"/>
+            <w:ind w:left="-115"/>
+            <w:jc w:val="left"/>
+          </w:pPr>
+          <w:r>
+            <w:drawing>
+              <wp:inline wp14:editId="20E48AA8" wp14:anchorId="2DAC9DB7">
+                <wp:extent cx="1755521" cy="504825"/>
+                <wp:effectExtent l="0" t="0" r="0" b="0"/>
+                <wp:docPr id="1166141909" name="drawing"/>
+                <wp:cNvGraphicFramePr>
+                  <a:graphicFrameLocks noChangeAspect="1"/>
+                </wp:cNvGraphicFramePr>
+                <a:graphic>
+                  <a:graphicData xmlns:a="http://schemas.openxmlformats.org/drawingml/2006/main" uri="http://schemas.openxmlformats.org/drawingml/2006/picture">
+                    <pic:pic xmlns:pic="http://schemas.openxmlformats.org/drawingml/2006/picture">
+                      <pic:nvPicPr xmlns:pic="http://schemas.openxmlformats.org/drawingml/2006/picture">
+                        <pic:cNvPr xmlns:pic="http://schemas.openxmlformats.org/drawingml/2006/picture" id="1166141909" name="Picture 1166141909"/>
+                        <pic:cNvPicPr xmlns:pic="http://schemas.openxmlformats.org/drawingml/2006/picture"/>
+                      </pic:nvPicPr>
+                      <pic:blipFill xmlns:pic="http://schemas.openxmlformats.org/drawingml/2006/picture">
+                        <a:blip xmlns:r="http://schemas.openxmlformats.org/officeDocument/2006/relationships" xmlns:a="http://schemas.openxmlformats.org/drawingml/2006/main" r:embed="rId1786370339">
+                          <a:extLst xmlns:a="http://schemas.openxmlformats.org/drawingml/2006/main">
+                            <a:ext xmlns:a="http://schemas.openxmlformats.org/drawingml/2006/main" uri="{28A0092B-C50C-407E-A947-70E740481C1C}">
+                              <a14:useLocalDpi xmlns:a14="http://schemas.microsoft.com/office/drawing/2010/main"/>
+                            </a:ext>
+                          </a:extLst>
+                        </a:blip>
+                        <a:stretch xmlns:a="http://schemas.openxmlformats.org/drawingml/2006/main">
+                          <a:fillRect xmlns:a="http://schemas.openxmlformats.org/drawingml/2006/main"/>
+                        </a:stretch>
+                      </pic:blipFill>
+                      <pic:spPr xmlns:pic="http://schemas.openxmlformats.org/drawingml/2006/picture">
+                        <a:xfrm xmlns:a="http://schemas.openxmlformats.org/drawingml/2006/main" rot="0">
+                          <a:off xmlns:a="http://schemas.openxmlformats.org/drawingml/2006/main" x="0" y="0"/>
+                          <a:ext xmlns:a="http://schemas.openxmlformats.org/drawingml/2006/main" cx="1755521" cy="504825"/>
+                        </a:xfrm>
+                        <a:prstGeom xmlns:a="http://schemas.openxmlformats.org/drawingml/2006/main" prst="rect">
+                          <a:avLst xmlns:a="http://schemas.openxmlformats.org/drawingml/2006/main"/>
+                        </a:prstGeom>
+                      </pic:spPr>
+                    </pic:pic>
+                  </a:graphicData>
+                </a:graphic>
+              </wp:inline>
+            </w:drawing>
+          </w:r>
+        </w:p>
+      </w:tc>
+      <w:tc>
+        <w:tcPr>
+          <w:tcW w:w="3005" w:type="dxa"/>
+          <w:tcMar/>
+        </w:tcPr>
+        <w:p>
+          <w:pPr>
+            <w:pStyle w:val="Header"/>
+            <w:bidi w:val="0"/>
+            <w:jc w:val="center"/>
+          </w:pPr>
+        </w:p>
+      </w:tc>
+      <w:tc>
+        <w:tcPr>
+          <w:tcW w:w="3135" w:type="dxa"/>
+          <w:tcMar/>
+        </w:tcPr>
+        <w:p>
+          <w:pPr>
+            <w:pStyle w:val="Header"/>
+            <w:bidi w:val="0"/>
+            <w:ind w:right="-115"/>
+            <w:jc w:val="right"/>
+          </w:pPr>
+          <w:r>
+            <w:rPr/>
+            <w:t>Data Room</w:t>
+          </w:r>
+        </w:p>
+        <w:p>
+          <w:pPr>
+            <w:pStyle w:val="Header"/>
+            <w:bidi w:val="0"/>
+            <w:ind w:right="-115"/>
+            <w:jc w:val="right"/>
+          </w:pPr>
+          <w:r>
+            <w:rPr/>
+            <w:t>Created at: 11.06.2026</w:t>
+          </w:r>
+        </w:p>
+        <w:p>
+          <w:pPr>
+            <w:pStyle w:val="Header"/>
+            <w:bidi w:val="0"/>
+            <w:ind w:right="-115"/>
+            <w:jc w:val="right"/>
+          </w:pPr>
+          <w:r>
+            <w:rPr/>
+            <w:t>Authored by: Xhurian Shaba</w:t>
+          </w:r>
+        </w:p>
+      </w:tc>
+    </w:tr>
+  </w:tbl>
+  <w:p>
+    <w:pPr>
+      <w:pStyle w:val="Header"/>
+      <w:bidi w:val="0"/>
+    </w:pPr>
+  </w:p>
+</w:hdr>
 </file>
 
 <file path=word/styles.xml><?xml version="1.0" encoding="utf-8"?>

</xml_diff>